<commit_message>
fix: corrige errores en documento
</commit_message>
<xml_diff>
--- a/MCDI503/docs/mcdi503_f23_sumativo_grupo5.docx
+++ b/MCDI503/docs/mcdi503_f23_sumativo_grupo5.docx
@@ -1037,7 +1037,43 @@
           <w:i w:val="0"/>
           <w:sz w:val="22"/>
         </w:rPr>
-        <w:t xml:space="preserve">: la proporción de camarote registrado decrece fuertemente desde primera hacia tercera clase, evidencia de que su ausencia es </w:t>
+        <w:t>: la proporción de camarote registrado decrece fuertemente desde primera hacia tercera clase (81.5% / 8.7% / 2.4%), asociación confirmada mediante una prueba chi-cuadrado formal (</w:t>
+      </w:r>
+      <w:r>
+        <w:rPr>
+          <w:rFonts w:ascii="Calibri" w:hAnsi="Calibri"/>
+          <w:b w:val="0"/>
+          <w:i/>
+          <w:sz w:val="22"/>
+        </w:rPr>
+        <w:t>Cabin_registrada</w:t>
+      </w:r>
+      <w:r>
+        <w:rPr>
+          <w:rFonts w:ascii="Calibri" w:hAnsi="Calibri"/>
+          <w:b w:val="0"/>
+          <w:i w:val="0"/>
+          <w:sz w:val="22"/>
+        </w:rPr>
+        <w:t xml:space="preserve"> ~ </w:t>
+      </w:r>
+      <w:r>
+        <w:rPr>
+          <w:rFonts w:ascii="Calibri" w:hAnsi="Calibri"/>
+          <w:b w:val="0"/>
+          <w:i/>
+          <w:sz w:val="22"/>
+        </w:rPr>
+        <w:t>Pclass</w:t>
+      </w:r>
+      <w:r>
+        <w:rPr>
+          <w:rFonts w:ascii="Calibri" w:hAnsi="Calibri"/>
+          <w:b w:val="0"/>
+          <w:i w:val="0"/>
+          <w:sz w:val="22"/>
+        </w:rPr>
+        <w:t xml:space="preserve">, p&lt;0.001), evidencia de que su ausencia es </w:t>
       </w:r>
       <w:r>
         <w:rPr>
@@ -1131,7 +1167,7 @@
           <w:i w:val="0"/>
           <w:sz w:val="22"/>
         </w:rPr>
-        <w:t xml:space="preserve"> —no con una mediana global—, decisión respaldada por un test de Kruskal-Wallis que confirma diferencias significativas de edad entre esos grupos (H=112.28; p&lt;0.001); se conservó el indicador </w:t>
+        <w:t xml:space="preserve"> —no con una mediana global—; un test de Kruskal-Wallis confirma diferencias significativas de edad entre esos grupos (H=112.28; p&lt;0.001), lo que motiva la estratificación (una mediana global subestimaría/sobrestimaría la edad en varios subgrupos), aunque el test no mide directamente el error de imputación de una estrategia frente a la otra. Se conservó el indicador </w:t>
       </w:r>
       <w:r>
         <w:rPr>
@@ -2425,7 +2461,7 @@
           <w:i w:val="0"/>
           <w:sz w:val="19"/>
         </w:rPr>
-        <w:t>*Title_agrupado y Deck_combinado presentan 16.7% y 27.8% de celdas con frecuencia esperada &lt;5 (categorías poco pobladas), lo que matiza la confiabilidad formal de su p-valor.</w:t>
+        <w:t>*Lectura de efecto según convención de Cohen (1988); los umbrales dependen de los grados de libertad (1 a 8 según la variable), por lo que la comparación directa entre variables es orientativa, no una escala única. Título_agrupado (16.7% de celdas con frecuencia esperada &lt;5) permanece dentro del umbral habitual de tolerancia (regla de Cochran: máx. 20%); Deck_combinado (27.8%) lo excede, por lo que su p-valor y su V deben interpretarse con mayor cautela.</w:t>
       </w:r>
     </w:p>
     <w:p>
@@ -2624,7 +2660,7 @@
           <w:i w:val="0"/>
           <w:sz w:val="22"/>
         </w:rPr>
-        <w:t xml:space="preserve">La detección de outliers (IQR y Z-score robusto/MAD, coincidentes en magnitud) identificó 116 casos atípicos en </w:t>
+        <w:t xml:space="preserve">La detección de outliers (IQR y Z-score robusto/MAD, del mismo orden de magnitud entre sí) identificó 116 casos atípicos en </w:t>
       </w:r>
       <w:r>
         <w:rPr>
@@ -2660,7 +2696,7 @@
           <w:i w:val="0"/>
           <w:sz w:val="22"/>
         </w:rPr>
-        <w:t xml:space="preserve"> (3.7%). El 90% de los outliers de </w:t>
+        <w:t xml:space="preserve"> (3.7%; estos últimos concentrados en su totalidad por encima de 57.75 años, sin ningún caso en el extremo bajo). El 90% de los outliers de </w:t>
       </w:r>
       <w:r>
         <w:rPr>
@@ -2696,7 +2732,7 @@
           <w:i w:val="0"/>
           <w:sz w:val="22"/>
         </w:rPr>
-        <w:t xml:space="preserve"> con otro pasajero, evidencia de que se trata de </w:t>
+        <w:t xml:space="preserve"> con otro pasajero, evidencia correlacional consistente con </w:t>
       </w:r>
       <w:r>
         <w:rPr>
@@ -2714,7 +2750,7 @@
           <w:i w:val="0"/>
           <w:sz w:val="22"/>
         </w:rPr>
-        <w:t xml:space="preserve"> (comportamiento relevante), no de errores de captura. Los 15 casos con </w:t>
+        <w:t xml:space="preserve"> más que con errores sistemáticos de captura, aunque no permite descartar por completo algún caso puntual de error dentro de ese grupo. Los 15 casos con </w:t>
       </w:r>
       <w:r>
         <w:rPr>
@@ -2881,6 +2917,40 @@
           <w:sz w:val="26"/>
         </w:rPr>
         <w:t>IX. Bibliografía</w:t>
+      </w:r>
+    </w:p>
+    <w:p>
+      <w:pPr>
+        <w:spacing w:line="276" w:lineRule="auto" w:after="80" w:before="0"/>
+        <w:ind w:left="283" w:hanging="283"/>
+        <w:jc w:val="both"/>
+      </w:pPr>
+      <w:r>
+        <w:rPr>
+          <w:rFonts w:ascii="Calibri" w:hAnsi="Calibri"/>
+          <w:b w:val="0"/>
+          <w:i w:val="0"/>
+          <w:sz w:val="19"/>
+        </w:rPr>
+        <w:t xml:space="preserve">Cohen, J. (1988). </w:t>
+      </w:r>
+      <w:r>
+        <w:rPr>
+          <w:rFonts w:ascii="Calibri" w:hAnsi="Calibri"/>
+          <w:b w:val="0"/>
+          <w:i/>
+          <w:sz w:val="19"/>
+        </w:rPr>
+        <w:t>Statistical power analysis for the behavioral sciences</w:t>
+      </w:r>
+      <w:r>
+        <w:rPr>
+          <w:rFonts w:ascii="Calibri" w:hAnsi="Calibri"/>
+          <w:b w:val="0"/>
+          <w:i w:val="0"/>
+          <w:sz w:val="19"/>
+        </w:rPr>
+        <w:t xml:space="preserve"> (2.ª ed.). Lawrence Erlbaum Associates.</w:t>
       </w:r>
     </w:p>
     <w:p>

</xml_diff>